<commit_message>
feat: add Practice Exam slide, LMS screenshot, rework Activity 6 to WhatsApp widget
Deck (67 slides):
- New "Practice Exam Portal" slide (exams.tertiaryinfotech.com) placed between
  Assessment Flow and the TRAQOM/Certification slide, with a site screenshot.
- Courseware & Assessment on the LMS: add a lms-tms.tertiaryinfotech.com
  screenshot alongside the steps, replacing the text-link-only layout.
- Activity 6 reworked from form pre/post hooks to a floating WhatsApp widget:
  bottom-right button, a hook that auto-opens it after 10 seconds, a
  "Hi! How can I help you?" prompt with suggested-query chips, and voice
  activation via the Web Speech API; Playwright MCP verifies the behaviour.

Learner Guide v1.4 and Lesson Plan v1.5 realigned to the deck (Activity 6
rewritten, slide ranges updated), each with a Version Control Record row.
README synced to the new slide count and artifact versions.

Co-Authored-By: Claude Opus 5 (1M context) <noreply@anthropic.com>
</commit_message>
<xml_diff>
--- a/courseware/LG-Agentic AI Applications with Claude Code.docx
+++ b/courseware/LG-Agentic AI Applications with Claude Code.docx
@@ -169,7 +169,7 @@
           <w:b/>
           <w:sz w:val="24"/>
         </w:rPr>
-        <w:t>Version 1.3</w:t>
+        <w:t>Version 1.4</w:t>
       </w:r>
     </w:p>
     <w:p>
@@ -516,6 +516,72 @@
           </w:p>
         </w:tc>
       </w:tr>
+      <w:tr>
+        <w:tc>
+          <w:tcPr>
+            <w:tcW w:type="dxa" w:w="2340"/>
+          </w:tcPr>
+          <w:p>
+            <w:r>
+              <w:t>1.4</w:t>
+            </w:r>
+            <w:r>
+              <w:rPr>
+                <w:b w:val="0"/>
+                <w:sz w:val="20"/>
+              </w:rPr>
+            </w:r>
+          </w:p>
+        </w:tc>
+        <w:tc>
+          <w:tcPr>
+            <w:tcW w:type="dxa" w:w="2340"/>
+          </w:tcPr>
+          <w:p>
+            <w:r>
+              <w:t>2 Sep 2026</w:t>
+            </w:r>
+            <w:r>
+              <w:rPr>
+                <w:b w:val="0"/>
+                <w:sz w:val="20"/>
+              </w:rPr>
+            </w:r>
+          </w:p>
+        </w:tc>
+        <w:tc>
+          <w:tcPr>
+            <w:tcW w:type="dxa" w:w="2340"/>
+          </w:tcPr>
+          <w:p>
+            <w:r>
+              <w:t>Reworked Activity 6 from form pre/post hooks to a floating WhatsApp widget with a 10-second auto-open hook, suggested queries and voice activation.</w:t>
+            </w:r>
+            <w:r>
+              <w:rPr>
+                <w:b w:val="0"/>
+                <w:sz w:val="20"/>
+              </w:rPr>
+            </w:r>
+          </w:p>
+        </w:tc>
+        <w:tc>
+          <w:tcPr>
+            <w:tcW w:type="dxa" w:w="2340"/>
+          </w:tcPr>
+          <w:p>
+            <w:r>
+              <w:t>Tertiary Infotech Academy Pte Ltd</w:t>
+            </w:r>
+            <w:r>
+              <w:rPr>
+                <w:b w:val="0"/>
+                <w:sz w:val="20"/>
+              </w:rPr>
+            </w:r>
+          </w:p>
+        </w:tc>
+      </w:tr>
     </w:tbl>
     <w:p>
       <w:r>
@@ -8263,7 +8329,7 @@
       </w:pPr>
       <w:bookmarkStart w:id="41" w:name="activity-6-hooks-form-pre-post"/>
       <w:r>
-        <w:t xml:space="preserve">Activity 6 — Hooks (Form Pre &amp; Post)</w:t>
+        <w:t>Activity 6 — Hooks (Floating WhatsApp Widget)</w:t>
       </w:r>
       <w:bookmarkEnd w:id="41"/>
     </w:p>
@@ -8275,73 +8341,49 @@
         <w:rPr>
           <w:b/>
         </w:rPr>
-        <w:t xml:space="preserve">Goal:</w:t>
-      </w:r>
-      <w:r>
-        <w:t xml:space="preserve"> </w:t>
-      </w:r>
-      <w:r>
-        <w:t xml:space="preserve">Use real Claude Code hooks</w:t>
-      </w:r>
-      <w:r>
-        <w:t xml:space="preserve"> </w:t>
-      </w:r>
+        <w:t xml:space="preserve">Goal: </w:t>
+      </w:r>
+      <w:r>
+        <w:t>Add a floating WhatsApp widget to the website from Activity 1, and use a Claude Code hook so it auto-opens after 10 seconds with suggested queries and voice activation.</w:t>
+      </w:r>
+      <w:r/>
+      <w:r/>
       <w:r>
         <w:rPr>
           <w:i/>
         </w:rPr>
-        <w:t xml:space="preserve">and</w:t>
-      </w:r>
-      <w:r>
-        <w:t xml:space="preserve"> </w:t>
-      </w:r>
-      <w:r>
-        <w:t xml:space="preserve">add the website form’s pre-submit and post-submit behaviour, then test both with Playwright.</w:t>
-      </w:r>
+      </w:r>
+      <w:r/>
+      <w:r/>
     </w:p>
     <w:p>
       <w:pPr>
         <w:pStyle w:val="BodyText"/>
       </w:pPr>
       <w:r>
-        <w:t xml:space="preserve">Claude Code hooks are shell commands that fire on Claude’s tool lifecycle (configured in</w:t>
-      </w:r>
-      <w:r>
-        <w:t xml:space="preserve"> </w:t>
-      </w:r>
+        <w:t>Claude Code hooks are shell commands that fire on Claude’s tool lifecycle (configured in .claude/settings.json, with scripts kept under .claude/hooks/). You don’t write them by hand — just ask Claude Code, in plain language, to create them. The widget behaviour itself lives in script.js on the site.</w:t>
+      </w:r>
+      <w:r/>
       <w:r>
         <w:rPr>
           <w:rStyle w:val="VerbatimChar"/>
         </w:rPr>
-        <w:t xml:space="preserve">.claude/settings.json</w:t>
-      </w:r>
-      <w:r>
-        <w:t xml:space="preserve">, with scripts kept under</w:t>
-      </w:r>
-      <w:r>
-        <w:t xml:space="preserve"> </w:t>
-      </w:r>
+      </w:r>
+      <w:r/>
+      <w:r/>
       <w:r>
         <w:rPr>
           <w:rStyle w:val="VerbatimChar"/>
         </w:rPr>
-        <w:t xml:space="preserve">.claude/hooks/</w:t>
-      </w:r>
-      <w:r>
-        <w:t xml:space="preserve">). You don’t write them by hand — just ask Claude Code, in plain language, to create them. The form’s pre-submit validation and post-submit voice + balloon are behaviour that lives in</w:t>
-      </w:r>
-      <w:r>
-        <w:t xml:space="preserve"> </w:t>
-      </w:r>
+      </w:r>
+      <w:r/>
+      <w:r/>
       <w:r>
         <w:rPr>
           <w:rStyle w:val="VerbatimChar"/>
         </w:rPr>
-        <w:t xml:space="preserve">script.js</w:t>
-      </w:r>
-      <w:r>
-        <w:t xml:space="preserve">.</w:t>
-      </w:r>
+      </w:r>
+      <w:r/>
     </w:p>
     <w:p>
       <w:pPr>
@@ -8372,41 +8414,27 @@
         <w:rPr>
           <w:b/>
         </w:rPr>
-        <w:t xml:space="preserve">Create the hooks</w:t>
-      </w:r>
-      <w:r>
-        <w:t xml:space="preserve"> </w:t>
-      </w:r>
-      <w:r>
-        <w:t xml:space="preserve">— ask Claude Code to create Claude Code hooks under</w:t>
-      </w:r>
-      <w:r>
-        <w:t xml:space="preserve"> </w:t>
-      </w:r>
+        <w:t xml:space="preserve">Add the widget — </w:t>
+      </w:r>
+      <w:r>
+        <w:t>ask Claude Code to add a floating WhatsApp widget fixed to the bottom-right of every page: a round WhatsApp button that expands into a small chat panel when clicked.</w:t>
+      </w:r>
+      <w:r/>
+      <w:r/>
       <w:r>
         <w:rPr>
           <w:rStyle w:val="VerbatimChar"/>
         </w:rPr>
-        <w:t xml:space="preserve">.claude/hooks/</w:t>
-      </w:r>
-      <w:r>
-        <w:t xml:space="preserve"> </w:t>
-      </w:r>
-      <w:r>
-        <w:t xml:space="preserve">(wired in</w:t>
-      </w:r>
-      <w:r>
-        <w:t xml:space="preserve"> </w:t>
-      </w:r>
+      </w:r>
+      <w:r/>
+      <w:r/>
+      <w:r/>
       <w:r>
         <w:rPr>
           <w:rStyle w:val="VerbatimChar"/>
         </w:rPr>
-        <w:t xml:space="preserve">.claude/settings.json</w:t>
-      </w:r>
-      <w:r>
-        <w:t xml:space="preserve">): a PreToolUse hook that guards before tools run, and a PostToolUse hook that runs after each edit. Then restart so they take effect.</w:t>
-      </w:r>
+      </w:r>
+      <w:r/>
     </w:p>
     <w:p>
       <w:pPr>
@@ -8419,14 +8447,12 @@
         <w:rPr>
           <w:b/>
         </w:rPr>
-        <w:t xml:space="preserve">Pre-submit validation</w:t>
-      </w:r>
-      <w:r>
-        <w:t xml:space="preserve"> </w:t>
-      </w:r>
-      <w:r>
-        <w:t xml:space="preserve">— ask Claude to validate every enquiry-form field on submit: name (required), email (valid format) and tel (digits only), showing inline error messages.</w:t>
-      </w:r>
+        <w:t xml:space="preserve">Auto-open after 10 seconds — </w:t>
+      </w:r>
+      <w:r>
+        <w:t>ask Claude to add a Claude Code hook (under .claude/hooks/, wired in .claude/settings.json) plus the page logic so the widget opens by itself 10 seconds after the page loads.</w:t>
+      </w:r>
+      <w:r/>
     </w:p>
     <w:p>
       <w:pPr>
@@ -8439,41 +8465,30 @@
         <w:rPr>
           <w:b/>
         </w:rPr>
-        <w:t xml:space="preserve">Post-submit voice + balloon</w:t>
-      </w:r>
-      <w:r>
-        <w:t xml:space="preserve"> </w:t>
-      </w:r>
-      <w:r>
-        <w:t xml:space="preserve">— ask Claude that, on a successful submit, it uses the Web Speech API to say</w:t>
-      </w:r>
-      <w:r>
-        <w:t xml:space="preserve"> </w:t>
-      </w:r>
+        <w:t xml:space="preserve">Prompt and suggested queries — </w:t>
+      </w:r>
+      <w:r>
+        <w:t>on auto-open, greet the visitor with “Hi! How can I help you?” and show 3–4 suggested queries as quick-reply chips (for example: course fees, schedule, funding). Add voice activation with the Web Speech API so the visitor can speak their question instead of typing.</w:t>
+      </w:r>
+      <w:r/>
+      <w:r/>
       <w:r>
         <w:rPr>
           <w:i/>
         </w:rPr>
-        <w:t xml:space="preserve">“</w:t>
       </w:r>
       <w:r>
         <w:rPr>
           <w:i/>
         </w:rPr>
-        <w:t xml:space="preserve">Hurray, thank you for your submission, we will get back to you in 3 business days.</w:t>
       </w:r>
       <w:r>
         <w:rPr>
           <w:i/>
         </w:rPr>
-        <w:t xml:space="preserve">”</w:t>
-      </w:r>
-      <w:r>
-        <w:t xml:space="preserve"> </w:t>
-      </w:r>
-      <w:r>
-        <w:t xml:space="preserve">and shows a balloon / confetti effect on the page.</w:t>
-      </w:r>
+      </w:r>
+      <w:r/>
+      <w:r/>
     </w:p>
     <w:p>
       <w:pPr>
@@ -8486,14 +8501,12 @@
         <w:rPr>
           <w:b/>
         </w:rPr>
-        <w:t xml:space="preserve">Test with Playwright</w:t>
-      </w:r>
-      <w:r>
-        <w:t xml:space="preserve"> </w:t>
-      </w:r>
-      <w:r>
-        <w:t xml:space="preserve">— ask Claude to use the Playwright MCP tool to (a) submit invalid data and confirm the validation errors appear (pre), and (b) submit valid data and confirm the success message, voice message and balloon effect fire (post).</w:t>
-      </w:r>
+        <w:t xml:space="preserve">Test with Playwright — </w:t>
+      </w:r>
+      <w:r>
+        <w:t>ask Claude to use the Playwright MCP tool to load the page, wait 10 seconds, and confirm the widget auto-opens with the greeting, the suggested queries and the voice-input control.</w:t>
+      </w:r>
+      <w:r/>
     </w:p>
     <w:p>
       <w:r>

</xml_diff>

<commit_message>
courseware: remove mini capstone project
</commit_message>
<xml_diff>
--- a/courseware/LG-Agentic AI Applications with Claude Code.docx
+++ b/courseware/LG-Agentic AI Applications with Claude Code.docx
@@ -169,7 +169,7 @@
           <w:b/>
           <w:sz w:val="24"/>
         </w:rPr>
-        <w:t>Version 1.7</w:t>
+        <w:t>Version 1.8</w:t>
       </w:r>
     </w:p>
     <w:p>
@@ -697,6 +697,7 @@
           </w:tcPr>
           <w:p>
             <w:r>
+              <w:rPr/>
               <w:t xml:space="preserve">1.7</w:t>
             </w:r>
           </w:p>
@@ -707,6 +708,7 @@
           </w:tcPr>
           <w:p>
             <w:r>
+              <w:rPr/>
               <w:t xml:space="preserve">9 Sep 2026</w:t>
             </w:r>
           </w:p>
@@ -717,6 +719,7 @@
           </w:tcPr>
           <w:p>
             <w:r>
+              <w:rPr/>
               <w:t xml:space="preserve">Added the Lab Materials section describing the four restructured lab folders. Fixed table column widths so all comparison tables render both columns.</w:t>
             </w:r>
           </w:p>
@@ -727,7 +730,62 @@
           </w:tcPr>
           <w:p>
             <w:r>
+              <w:rPr/>
               <w:t xml:space="preserve">Tertiary Infotech Academy Pte Ltd</w:t>
+            </w:r>
+          </w:p>
+        </w:tc>
+      </w:tr>
+      <w:tr>
+        <w:tc>
+          <w:tcPr>
+            <w:tcW w:type="dxa" w:w="2340"/>
+          </w:tcPr>
+          <w:p>
+            <w:pPr/>
+            <w:r>
+              <w:rPr>
+                <w:rPr/>
+              </w:rPr>
+              <w:t>1.8</w:t>
+            </w:r>
+          </w:p>
+        </w:tc>
+        <w:tc>
+          <w:tcPr>
+            <w:tcW w:type="dxa" w:w="2340"/>
+          </w:tcPr>
+          <w:p>
+            <w:pPr/>
+            <w:r>
+              <w:rPr>
+                <w:rPr/>
+              </w:rPr>
+              <w:t>9 Sep 2026</w:t>
+            </w:r>
+          </w:p>
+        </w:tc>
+        <w:tc>
+          <w:tcPr>
+            <w:tcW w:type="dxa" w:w="2340"/>
+          </w:tcPr>
+          <w:p>
+            <w:r>
+              <w:t>Removed the final project and presentation requirement; retained the connected activities, deployment checks and assessment flow.</w:t>
+            </w:r>
+          </w:p>
+        </w:tc>
+        <w:tc>
+          <w:tcPr>
+            <w:tcW w:type="dxa" w:w="2340"/>
+          </w:tcPr>
+          <w:p>
+            <w:pPr/>
+            <w:r>
+              <w:rPr>
+                <w:rPr/>
+              </w:rPr>
+              <w:t>Tertiary Infotech Academy Pte Ltd</w:t>
             </w:r>
           </w:p>
         </w:tc>
@@ -751,12 +809,60 @@
       </w:r>
     </w:p>
     <w:p>
-      <w:r>
-        <w:fldChar w:fldCharType="begin"/>
-        <w:instrText xml:space="preserve">TOC \o "1-3" \h \z \u</w:instrText>
-        <w:fldChar w:fldCharType="separate"/>
-        <w:t>Right-click and choose “Update Field”, or press F9, to build the table of contents.</w:t>
-        <w:fldChar w:fldCharType="end"/>
+      <w:pPr>
+        <w:tabs>
+          <w:tab w:pos="9072" w:val="right" w:leader="dot"/>
+        </w:tabs>
+        <w:spacing w:after="60"/>
+      </w:pPr>
+      <w:r>
+        <w:rPr>
+          <w:rFonts w:ascii="Arial" w:hAnsi="Arial"/>
+          <w:b/>
+          <w:color w:val="333333"/>
+          <w:sz w:val="22"/>
+        </w:rPr>
+        <w:t>Topic 1 — Claude Code Fundamentals</w:t>
+        <w:tab/>
+        <w:t>5</w:t>
+      </w:r>
+    </w:p>
+    <w:p>
+      <w:pPr>
+        <w:tabs>
+          <w:tab w:pos="9072" w:val="right" w:leader="dot"/>
+        </w:tabs>
+        <w:spacing w:after="60"/>
+      </w:pPr>
+      <w:r>
+        <w:rPr>
+          <w:rFonts w:ascii="Arial" w:hAnsi="Arial"/>
+          <w:b/>
+          <w:color w:val="333333"/>
+          <w:sz w:val="22"/>
+        </w:rPr>
+        <w:t>Topic 2 — Tools and Commands</w:t>
+        <w:tab/>
+        <w:t>12</w:t>
+      </w:r>
+    </w:p>
+    <w:p>
+      <w:pPr>
+        <w:tabs>
+          <w:tab w:pos="9072" w:val="right" w:leader="dot"/>
+        </w:tabs>
+        <w:spacing w:after="60"/>
+      </w:pPr>
+      <w:r>
+        <w:rPr>
+          <w:rFonts w:ascii="Arial" w:hAnsi="Arial"/>
+          <w:b/>
+          <w:color w:val="333333"/>
+          <w:sz w:val="22"/>
+        </w:rPr>
+        <w:t>Topic 3 — Skills, Agents &amp; Hooks</w:t>
+        <w:tab/>
+        <w:t>15</w:t>
       </w:r>
     </w:p>
     <w:p>
@@ -9052,7 +9158,7 @@
       </w:pPr>
       <w:bookmarkStart w:id="43" w:name="activity-7-test-convert-present"/>
       <w:r>
-        <w:t xml:space="preserve">Activity 7 — Test, Convert &amp; Present</w:t>
+        <w:t>Activity 7 — Test, Optimise &amp; Deploy</w:t>
       </w:r>
       <w:bookmarkEnd w:id="43"/>
     </w:p>
@@ -9064,14 +9170,10 @@
         <w:rPr>
           <w:b/>
         </w:rPr>
-        <w:t xml:space="preserve">Goal:</w:t>
-      </w:r>
-      <w:r>
-        <w:t xml:space="preserve"> </w:t>
-      </w:r>
-      <w:r>
-        <w:t xml:space="preserve">Test the enquiry form, add a WhatsApp widget, run final checks and present your project.</w:t>
-      </w:r>
+        <w:t>Goal: Test the enquiry form, add a WhatsApp widget, run final checks, deploy the final version and verify the live site.</w:t>
+      </w:r>
+      <w:r/>
+      <w:r/>
     </w:p>
     <w:p>
       <w:pPr>
@@ -9324,510 +9426,6 @@
       </w:r>
       <w:r>
         <w:t xml:space="preserve">redeploy GitHub Pages.</w:t>
-      </w:r>
-    </w:p>
-    <w:p>
-      <w:pPr>
-        <w:numPr>
-          <w:ilvl w:val="0"/>
-          <w:numId w:val="38"/>
-        </w:numPr>
-      </w:pPr>
-      <w:r>
-        <w:rPr>
-          <w:b/>
-        </w:rPr>
-        <w:t xml:space="preserve">Prepare your capstone presentation.</w:t>
-      </w:r>
-      <w:r>
-        <w:t xml:space="preserve"> </w:t>
-      </w:r>
-      <w:r>
-        <w:t xml:space="preserve">Cover:</w:t>
-      </w:r>
-    </w:p>
-    <w:p>
-      <w:pPr>
-        <w:numPr>
-          <w:ilvl w:val="1"/>
-          <w:numId w:val="39"/>
-        </w:numPr>
-        <w:pStyle w:val="Compact"/>
-      </w:pPr>
-      <w:r>
-        <w:t xml:space="preserve">What you built and the live URL</w:t>
-      </w:r>
-    </w:p>
-    <w:p>
-      <w:pPr>
-        <w:numPr>
-          <w:ilvl w:val="1"/>
-          <w:numId w:val="39"/>
-        </w:numPr>
-        <w:pStyle w:val="Compact"/>
-      </w:pPr>
-      <w:r>
-        <w:t xml:space="preserve">The agentic loop and context techniques you used</w:t>
-      </w:r>
-    </w:p>
-    <w:p>
-      <w:pPr>
-        <w:numPr>
-          <w:ilvl w:val="1"/>
-          <w:numId w:val="39"/>
-        </w:numPr>
-        <w:pStyle w:val="Compact"/>
-      </w:pPr>
-      <w:r>
-        <w:t xml:space="preserve">Your</w:t>
-      </w:r>
-      <w:r>
-        <w:t xml:space="preserve"> </w:t>
-      </w:r>
-      <w:r>
-        <w:rPr>
-          <w:rStyle w:val="VerbatimChar"/>
-        </w:rPr>
-        <w:t xml:space="preserve">/gitpush</w:t>
-      </w:r>
-      <w:r>
-        <w:t xml:space="preserve"> </w:t>
-      </w:r>
-      <w:r>
-        <w:t xml:space="preserve">custom command</w:t>
-      </w:r>
-    </w:p>
-    <w:p>
-      <w:pPr>
-        <w:numPr>
-          <w:ilvl w:val="1"/>
-          <w:numId w:val="39"/>
-        </w:numPr>
-        <w:pStyle w:val="Compact"/>
-      </w:pPr>
-      <w:r>
-        <w:t xml:space="preserve">MCP tools (Playwright) and what you tested</w:t>
-      </w:r>
-    </w:p>
-    <w:p>
-      <w:pPr>
-        <w:numPr>
-          <w:ilvl w:val="1"/>
-          <w:numId w:val="39"/>
-        </w:numPr>
-        <w:pStyle w:val="Compact"/>
-      </w:pPr>
-      <w:r>
-        <w:t xml:space="preserve">Skills, sub agents and hooks you added</w:t>
-      </w:r>
-    </w:p>
-    <w:p>
-      <w:pPr>
-        <w:numPr>
-          <w:ilvl w:val="1"/>
-          <w:numId w:val="39"/>
-        </w:numPr>
-        <w:pStyle w:val="Compact"/>
-      </w:pPr>
-      <w:r>
-        <w:t xml:space="preserve">Security and lead-conversion improvements</w:t>
-      </w:r>
-    </w:p>
-    <w:p>
-      <w:pPr>
-        <w:numPr>
-          <w:ilvl w:val="0"/>
-          <w:numId w:val="38"/>
-        </w:numPr>
-      </w:pPr>
-      <w:r>
-        <w:rPr>
-          <w:b/>
-        </w:rPr>
-        <w:t xml:space="preserve">Present to the class.</w:t>
-      </w:r>
-    </w:p>
-    <w:p>
-      <w:r>
-        <w:pict>
-          <v:rect style="width:0;height:1.5pt" o:hralign="center" o:hrstd="t" o:hr="t"/>
-        </w:pict>
-      </w:r>
-    </w:p>
-    <w:p>
-      <w:pPr>
-        <w:pStyle w:val="Heading2"/>
-      </w:pPr>
-      <w:bookmarkStart w:id="45" w:name="capstone-project"/>
-      <w:r>
-        <w:t xml:space="preserve">Capstone Project</w:t>
-      </w:r>
-      <w:bookmarkEnd w:id="45"/>
-    </w:p>
-    <w:p>
-      <w:pPr>
-        <w:pStyle w:val="FirstParagraph"/>
-      </w:pPr>
-      <w:r>
-        <w:rPr>
-          <w:b/>
-        </w:rPr>
-        <w:t xml:space="preserve">Goal:</w:t>
-      </w:r>
-      <w:r>
-        <w:t xml:space="preserve"> </w:t>
-      </w:r>
-      <w:r>
-        <w:t xml:space="preserve">Create your</w:t>
-      </w:r>
-      <w:r>
-        <w:t xml:space="preserve"> </w:t>
-      </w:r>
-      <w:r>
-        <w:rPr>
-          <w:b/>
-        </w:rPr>
-        <w:t xml:space="preserve">own new project</w:t>
-      </w:r>
-      <w:r>
-        <w:t xml:space="preserve"> </w:t>
-      </w:r>
-      <w:r>
-        <w:t xml:space="preserve">with Claude Code using the</w:t>
-      </w:r>
-      <w:r>
-        <w:t xml:space="preserve"> </w:t>
-      </w:r>
-      <w:r>
-        <w:rPr>
-          <w:b/>
-        </w:rPr>
-        <w:t xml:space="preserve">7-step workflow</w:t>
-      </w:r>
-      <w:r>
-        <w:t xml:space="preserve">, then present it. Your project can be a</w:t>
-      </w:r>
-      <w:r>
-        <w:t xml:space="preserve"> </w:t>
-      </w:r>
-      <w:r>
-        <w:rPr>
-          <w:b/>
-        </w:rPr>
-        <w:t xml:space="preserve">website, a web tool, a full-stack app, or a mobile app</w:t>
-      </w:r>
-      <w:r>
-        <w:t xml:space="preserve">.</w:t>
-      </w:r>
-    </w:p>
-    <w:p>
-      <w:pPr>
-        <w:pStyle w:val="Heading3"/>
-      </w:pPr>
-      <w:bookmarkStart w:id="46" w:name="draft-your-build-prompt"/>
-      <w:r>
-        <w:t xml:space="preserve">Draft your build prompt</w:t>
-      </w:r>
-      <w:bookmarkEnd w:id="46"/>
-    </w:p>
-    <w:p>
-      <w:pPr>
-        <w:pStyle w:val="FirstParagraph"/>
-      </w:pPr>
-      <w:r>
-        <w:t xml:space="preserve">Not sure how to phrase it? Ask a chatbot (ChatGPT or Claude) to write your build prompt first, then paste the result into Claude Code:</w:t>
-      </w:r>
-    </w:p>
-    <w:p>
-      <w:pPr>
-        <w:pStyle w:val="SourceCode"/>
-      </w:pPr>
-      <w:r>
-        <w:rPr>
-          <w:rStyle w:val="VerbatimChar"/>
-        </w:rPr>
-        <w:t xml:space="preserve">Create a prompt to build a web app for [your idea]</w:t>
-      </w:r>
-      <w:r>
-        <w:br/>
-      </w:r>
-      <w:r>
-        <w:rPr>
-          <w:rStyle w:val="VerbatimChar"/>
-        </w:rPr>
-        <w:t xml:space="preserve">with the following features:</w:t>
-      </w:r>
-      <w:r>
-        <w:br/>
-      </w:r>
-      <w:r>
-        <w:rPr>
-          <w:rStyle w:val="VerbatimChar"/>
-        </w:rPr>
-        <w:t xml:space="preserve">  - [feature 1]</w:t>
-      </w:r>
-      <w:r>
-        <w:br/>
-      </w:r>
-      <w:r>
-        <w:rPr>
-          <w:rStyle w:val="VerbatimChar"/>
-        </w:rPr>
-        <w:t xml:space="preserve">  - [feature 2]</w:t>
-      </w:r>
-      <w:r>
-        <w:br/>
-      </w:r>
-      <w:r>
-        <w:rPr>
-          <w:rStyle w:val="VerbatimChar"/>
-        </w:rPr>
-        <w:t xml:space="preserve">  - [feature 3]</w:t>
-      </w:r>
-      <w:r>
-        <w:br/>
-      </w:r>
-      <w:r>
-        <w:rPr>
-          <w:rStyle w:val="VerbatimChar"/>
-        </w:rPr>
-        <w:t xml:space="preserve">It should be built in HTML / CSS / JavaScript.</w:t>
-      </w:r>
-      <w:r>
-        <w:br/>
-      </w:r>
-      <w:r>
-        <w:rPr>
-          <w:rStyle w:val="VerbatimChar"/>
-        </w:rPr>
-        <w:t xml:space="preserve">Output the prompt in markdown format.</w:t>
-      </w:r>
-    </w:p>
-    <w:p>
-      <w:pPr>
-        <w:pStyle w:val="Heading3"/>
-      </w:pPr>
-      <w:bookmarkStart w:id="47" w:name="step-by-step-8"/>
-      <w:r>
-        <w:t xml:space="preserve">Step-by-step</w:t>
-      </w:r>
-      <w:bookmarkEnd w:id="47"/>
-    </w:p>
-    <w:p>
-      <w:pPr>
-        <w:numPr>
-          <w:ilvl w:val="0"/>
-          <w:numId w:val="40"/>
-        </w:numPr>
-        <w:pStyle w:val="Compact"/>
-      </w:pPr>
-      <w:r>
-        <w:rPr>
-          <w:b/>
-        </w:rPr>
-        <w:t xml:space="preserve">Pick an idea</w:t>
-      </w:r>
-      <w:r>
-        <w:t xml:space="preserve"> </w:t>
-      </w:r>
-      <w:r>
-        <w:t xml:space="preserve">— decide what to build (website, web tool, full-stack or mobile app).</w:t>
-      </w:r>
-    </w:p>
-    <w:p>
-      <w:pPr>
-        <w:numPr>
-          <w:ilvl w:val="0"/>
-          <w:numId w:val="40"/>
-        </w:numPr>
-        <w:pStyle w:val="Compact"/>
-      </w:pPr>
-      <w:r>
-        <w:rPr>
-          <w:b/>
-        </w:rPr>
-        <w:t xml:space="preserve">Step 1 — Goal &amp; Features.</w:t>
-      </w:r>
-      <w:r>
-        <w:t xml:space="preserve"> </w:t>
-      </w:r>
-      <w:r>
-        <w:t xml:space="preserve">Draft a clear, detailed build prompt (use ChatGPT to help expand the idea).</w:t>
-      </w:r>
-    </w:p>
-    <w:p>
-      <w:pPr>
-        <w:numPr>
-          <w:ilvl w:val="0"/>
-          <w:numId w:val="40"/>
-        </w:numPr>
-        <w:pStyle w:val="Compact"/>
-      </w:pPr>
-      <w:r>
-        <w:rPr>
-          <w:b/>
-        </w:rPr>
-        <w:t xml:space="preserve">Step 2 — Plan Mode.</w:t>
-      </w:r>
-      <w:r>
-        <w:t xml:space="preserve"> </w:t>
-      </w:r>
-      <w:r>
-        <w:t xml:space="preserve">Let Claude plan the build (Shift+Tab) and review the plan.</w:t>
-      </w:r>
-    </w:p>
-    <w:p>
-      <w:pPr>
-        <w:numPr>
-          <w:ilvl w:val="0"/>
-          <w:numId w:val="40"/>
-        </w:numPr>
-        <w:pStyle w:val="Compact"/>
-      </w:pPr>
-      <w:r>
-        <w:rPr>
-          <w:b/>
-        </w:rPr>
-        <w:t xml:space="preserve">Step 3 — Execute (Bypass Permissions).</w:t>
-      </w:r>
-      <w:r>
-        <w:t xml:space="preserve"> </w:t>
-      </w:r>
-      <w:r>
-        <w:t xml:space="preserve">Approve the plan and let Claude build it.</w:t>
-      </w:r>
-    </w:p>
-    <w:p>
-      <w:pPr>
-        <w:numPr>
-          <w:ilvl w:val="0"/>
-          <w:numId w:val="40"/>
-        </w:numPr>
-        <w:pStyle w:val="Compact"/>
-      </w:pPr>
-      <w:r>
-        <w:rPr>
-          <w:b/>
-        </w:rPr>
-        <w:t xml:space="preserve">Step 4 — Context (</w:t>
-      </w:r>
-      <w:r>
-        <w:rPr>
-          <w:rStyle w:val="VerbatimChar"/>
-          <w:b/>
-        </w:rPr>
-        <w:t xml:space="preserve">/init</w:t>
-      </w:r>
-      <w:r>
-        <w:rPr>
-          <w:b/>
-        </w:rPr>
-        <w:t xml:space="preserve">).</w:t>
-      </w:r>
-      <w:r>
-        <w:t xml:space="preserve"> </w:t>
-      </w:r>
-      <w:r>
-        <w:t xml:space="preserve">Generate a</w:t>
-      </w:r>
-      <w:r>
-        <w:t xml:space="preserve"> </w:t>
-      </w:r>
-      <w:r>
-        <w:rPr>
-          <w:rStyle w:val="VerbatimChar"/>
-        </w:rPr>
-        <w:t xml:space="preserve">CLAUDE.md</w:t>
-      </w:r>
-      <w:r>
-        <w:t xml:space="preserve"> </w:t>
-      </w:r>
-      <w:r>
-        <w:t xml:space="preserve">for your project.</w:t>
-      </w:r>
-    </w:p>
-    <w:p>
-      <w:pPr>
-        <w:numPr>
-          <w:ilvl w:val="0"/>
-          <w:numId w:val="40"/>
-        </w:numPr>
-        <w:pStyle w:val="Compact"/>
-      </w:pPr>
-      <w:r>
-        <w:rPr>
-          <w:b/>
-        </w:rPr>
-        <w:t xml:space="preserve">Step 5 — Commit to GitHub.</w:t>
-      </w:r>
-      <w:r>
-        <w:t xml:space="preserve"> </w:t>
-      </w:r>
-      <w:r>
-        <w:t xml:space="preserve">Initialise git and push your code.</w:t>
-      </w:r>
-    </w:p>
-    <w:p>
-      <w:pPr>
-        <w:numPr>
-          <w:ilvl w:val="0"/>
-          <w:numId w:val="40"/>
-        </w:numPr>
-        <w:pStyle w:val="Compact"/>
-      </w:pPr>
-      <w:r>
-        <w:rPr>
-          <w:b/>
-        </w:rPr>
-        <w:t xml:space="preserve">Step 6 — Deployment.</w:t>
-      </w:r>
-      <w:r>
-        <w:t xml:space="preserve"> </w:t>
-      </w:r>
-      <w:r>
-        <w:t xml:space="preserve">Deploy your app (e.g. GitHub Pages for web projects).</w:t>
-      </w:r>
-    </w:p>
-    <w:p>
-      <w:pPr>
-        <w:numPr>
-          <w:ilvl w:val="0"/>
-          <w:numId w:val="40"/>
-        </w:numPr>
-        <w:pStyle w:val="Compact"/>
-      </w:pPr>
-      <w:r>
-        <w:rPr>
-          <w:b/>
-        </w:rPr>
-        <w:t xml:space="preserve">Step 7 — CI/CD.</w:t>
-      </w:r>
-      <w:r>
-        <w:t xml:space="preserve"> </w:t>
-      </w:r>
-      <w:r>
-        <w:t xml:space="preserve">Automate redeploys with GitHub Actions.</w:t>
-      </w:r>
-    </w:p>
-    <w:p>
-      <w:pPr>
-        <w:numPr>
-          <w:ilvl w:val="0"/>
-          <w:numId w:val="40"/>
-        </w:numPr>
-        <w:pStyle w:val="Compact"/>
-      </w:pPr>
-      <w:r>
-        <w:rPr>
-          <w:b/>
-        </w:rPr>
-        <w:t xml:space="preserve">Present</w:t>
-      </w:r>
-      <w:r>
-        <w:t xml:space="preserve"> </w:t>
-      </w:r>
-      <w:r>
-        <w:t xml:space="preserve">— demo your project and walk through how you built it with Claude Code.</w:t>
       </w:r>
     </w:p>
     <w:p>
@@ -10341,11 +9939,15 @@
         </w:trPr>
         <w:tc>
           <w:tcPr>
-            <w:tcW w:w="2640" w:type="dxa"/>
+            <w:tcW w:w="3096" w:type="dxa"/>
             <w:tcBorders>
               <w:bottom w:val="single"/>
             </w:tcBorders>
             <w:vAlign w:val="bottom"/>
+            <w:tcMar>
+              <w:left w:w="100" w:type="dxa"/>
+              <w:right w:w="100" w:type="dxa"/>
+            </w:tcMar>
           </w:tcPr>
           <w:p>
             <w:pPr>
@@ -10359,11 +9961,15 @@
         </w:tc>
         <w:tc>
           <w:tcPr>
-            <w:tcW w:w="5280" w:type="dxa"/>
+            <w:tcW w:w="4824" w:type="dxa"/>
             <w:tcBorders>
               <w:bottom w:val="single"/>
             </w:tcBorders>
             <w:vAlign w:val="bottom"/>
+            <w:tcMar>
+              <w:left w:w="100" w:type="dxa"/>
+              <w:right w:w="100" w:type="dxa"/>
+            </w:tcMar>
           </w:tcPr>
           <w:p>
             <w:pPr>
@@ -10379,7 +9985,11 @@
       <w:tr>
         <w:tc>
           <w:tcPr>
-            <w:tcW w:w="2640" w:type="dxa"/>
+            <w:tcW w:w="3096" w:type="dxa"/>
+            <w:tcMar>
+              <w:left w:w="100" w:type="dxa"/>
+              <w:right w:w="100" w:type="dxa"/>
+            </w:tcMar>
           </w:tcPr>
           <w:p>
             <w:pPr>
@@ -10396,7 +10006,11 @@
         </w:tc>
         <w:tc>
           <w:tcPr>
-            <w:tcW w:w="5280" w:type="dxa"/>
+            <w:tcW w:w="4824" w:type="dxa"/>
+            <w:tcMar>
+              <w:left w:w="100" w:type="dxa"/>
+              <w:right w:w="100" w:type="dxa"/>
+            </w:tcMar>
           </w:tcPr>
           <w:p>
             <w:pPr>
@@ -10412,7 +10026,11 @@
       <w:tr>
         <w:tc>
           <w:tcPr>
-            <w:tcW w:w="2640" w:type="dxa"/>
+            <w:tcW w:w="3096" w:type="dxa"/>
+            <w:tcMar>
+              <w:left w:w="100" w:type="dxa"/>
+              <w:right w:w="100" w:type="dxa"/>
+            </w:tcMar>
           </w:tcPr>
           <w:p>
             <w:pPr>
@@ -10444,7 +10062,11 @@
         </w:tc>
         <w:tc>
           <w:tcPr>
-            <w:tcW w:w="5280" w:type="dxa"/>
+            <w:tcW w:w="4824" w:type="dxa"/>
+            <w:tcMar>
+              <w:left w:w="100" w:type="dxa"/>
+              <w:right w:w="100" w:type="dxa"/>
+            </w:tcMar>
           </w:tcPr>
           <w:p>
             <w:pPr>
@@ -10460,7 +10082,11 @@
       <w:tr>
         <w:tc>
           <w:tcPr>
-            <w:tcW w:w="2640" w:type="dxa"/>
+            <w:tcW w:w="3096" w:type="dxa"/>
+            <w:tcMar>
+              <w:left w:w="100" w:type="dxa"/>
+              <w:right w:w="100" w:type="dxa"/>
+            </w:tcMar>
           </w:tcPr>
           <w:p>
             <w:pPr>
@@ -10477,7 +10103,11 @@
         </w:tc>
         <w:tc>
           <w:tcPr>
-            <w:tcW w:w="5280" w:type="dxa"/>
+            <w:tcW w:w="4824" w:type="dxa"/>
+            <w:tcMar>
+              <w:left w:w="100" w:type="dxa"/>
+              <w:right w:w="100" w:type="dxa"/>
+            </w:tcMar>
           </w:tcPr>
           <w:p>
             <w:pPr>
@@ -10508,7 +10138,11 @@
       <w:tr>
         <w:tc>
           <w:tcPr>
-            <w:tcW w:w="2640" w:type="dxa"/>
+            <w:tcW w:w="3096" w:type="dxa"/>
+            <w:tcMar>
+              <w:left w:w="100" w:type="dxa"/>
+              <w:right w:w="100" w:type="dxa"/>
+            </w:tcMar>
           </w:tcPr>
           <w:p>
             <w:pPr>
@@ -10525,7 +10159,11 @@
         </w:tc>
         <w:tc>
           <w:tcPr>
-            <w:tcW w:w="5280" w:type="dxa"/>
+            <w:tcW w:w="4824" w:type="dxa"/>
+            <w:tcMar>
+              <w:left w:w="100" w:type="dxa"/>
+              <w:right w:w="100" w:type="dxa"/>
+            </w:tcMar>
           </w:tcPr>
           <w:p>
             <w:pPr>
@@ -10541,7 +10179,11 @@
       <w:tr>
         <w:tc>
           <w:tcPr>
-            <w:tcW w:w="2640" w:type="dxa"/>
+            <w:tcW w:w="3096" w:type="dxa"/>
+            <w:tcMar>
+              <w:left w:w="100" w:type="dxa"/>
+              <w:right w:w="100" w:type="dxa"/>
+            </w:tcMar>
           </w:tcPr>
           <w:p>
             <w:pPr>
@@ -10558,7 +10200,11 @@
         </w:tc>
         <w:tc>
           <w:tcPr>
-            <w:tcW w:w="5280" w:type="dxa"/>
+            <w:tcW w:w="4824" w:type="dxa"/>
+            <w:tcMar>
+              <w:left w:w="100" w:type="dxa"/>
+              <w:right w:w="100" w:type="dxa"/>
+            </w:tcMar>
           </w:tcPr>
           <w:p>
             <w:pPr>
@@ -10574,7 +10220,11 @@
       <w:tr>
         <w:tc>
           <w:tcPr>
-            <w:tcW w:w="2640" w:type="dxa"/>
+            <w:tcW w:w="3096" w:type="dxa"/>
+            <w:tcMar>
+              <w:left w:w="100" w:type="dxa"/>
+              <w:right w:w="100" w:type="dxa"/>
+            </w:tcMar>
           </w:tcPr>
           <w:p>
             <w:pPr>
@@ -10591,7 +10241,11 @@
         </w:tc>
         <w:tc>
           <w:tcPr>
-            <w:tcW w:w="5280" w:type="dxa"/>
+            <w:tcW w:w="4824" w:type="dxa"/>
+            <w:tcMar>
+              <w:left w:w="100" w:type="dxa"/>
+              <w:right w:w="100" w:type="dxa"/>
+            </w:tcMar>
           </w:tcPr>
           <w:p>
             <w:pPr>
@@ -10607,7 +10261,11 @@
       <w:tr>
         <w:tc>
           <w:tcPr>
-            <w:tcW w:w="2640" w:type="dxa"/>
+            <w:tcW w:w="3096" w:type="dxa"/>
+            <w:tcMar>
+              <w:left w:w="100" w:type="dxa"/>
+              <w:right w:w="100" w:type="dxa"/>
+            </w:tcMar>
           </w:tcPr>
           <w:p>
             <w:pPr>
@@ -10624,7 +10282,11 @@
         </w:tc>
         <w:tc>
           <w:tcPr>
-            <w:tcW w:w="5280" w:type="dxa"/>
+            <w:tcW w:w="4824" w:type="dxa"/>
+            <w:tcMar>
+              <w:left w:w="100" w:type="dxa"/>
+              <w:right w:w="100" w:type="dxa"/>
+            </w:tcMar>
           </w:tcPr>
           <w:p>
             <w:pPr>
@@ -10640,7 +10302,11 @@
       <w:tr>
         <w:tc>
           <w:tcPr>
-            <w:tcW w:w="2640" w:type="dxa"/>
+            <w:tcW w:w="3096" w:type="dxa"/>
+            <w:tcMar>
+              <w:left w:w="100" w:type="dxa"/>
+              <w:right w:w="100" w:type="dxa"/>
+            </w:tcMar>
           </w:tcPr>
           <w:p>
             <w:pPr>
@@ -10657,7 +10323,11 @@
         </w:tc>
         <w:tc>
           <w:tcPr>
-            <w:tcW w:w="5280" w:type="dxa"/>
+            <w:tcW w:w="4824" w:type="dxa"/>
+            <w:tcMar>
+              <w:left w:w="100" w:type="dxa"/>
+              <w:right w:w="100" w:type="dxa"/>
+            </w:tcMar>
           </w:tcPr>
           <w:p>
             <w:pPr>
@@ -10673,7 +10343,11 @@
       <w:tr>
         <w:tc>
           <w:tcPr>
-            <w:tcW w:w="2640" w:type="dxa"/>
+            <w:tcW w:w="3096" w:type="dxa"/>
+            <w:tcMar>
+              <w:left w:w="100" w:type="dxa"/>
+              <w:right w:w="100" w:type="dxa"/>
+            </w:tcMar>
           </w:tcPr>
           <w:p>
             <w:pPr>
@@ -10690,7 +10364,11 @@
         </w:tc>
         <w:tc>
           <w:tcPr>
-            <w:tcW w:w="5280" w:type="dxa"/>
+            <w:tcW w:w="4824" w:type="dxa"/>
+            <w:tcMar>
+              <w:left w:w="100" w:type="dxa"/>
+              <w:right w:w="100" w:type="dxa"/>
+            </w:tcMar>
           </w:tcPr>
           <w:p>
             <w:pPr>
@@ -10706,7 +10384,11 @@
       <w:tr>
         <w:tc>
           <w:tcPr>
-            <w:tcW w:w="2640" w:type="dxa"/>
+            <w:tcW w:w="3096" w:type="dxa"/>
+            <w:tcMar>
+              <w:left w:w="100" w:type="dxa"/>
+              <w:right w:w="100" w:type="dxa"/>
+            </w:tcMar>
           </w:tcPr>
           <w:p>
             <w:pPr>
@@ -10738,7 +10420,11 @@
         </w:tc>
         <w:tc>
           <w:tcPr>
-            <w:tcW w:w="5280" w:type="dxa"/>
+            <w:tcW w:w="4824" w:type="dxa"/>
+            <w:tcMar>
+              <w:left w:w="100" w:type="dxa"/>
+              <w:right w:w="100" w:type="dxa"/>
+            </w:tcMar>
           </w:tcPr>
           <w:p>
             <w:pPr>
@@ -10754,7 +10440,11 @@
       <w:tr>
         <w:tc>
           <w:tcPr>
-            <w:tcW w:w="2640" w:type="dxa"/>
+            <w:tcW w:w="3096" w:type="dxa"/>
+            <w:tcMar>
+              <w:left w:w="100" w:type="dxa"/>
+              <w:right w:w="100" w:type="dxa"/>
+            </w:tcMar>
           </w:tcPr>
           <w:p>
             <w:pPr>
@@ -10771,7 +10461,11 @@
         </w:tc>
         <w:tc>
           <w:tcPr>
-            <w:tcW w:w="5280" w:type="dxa"/>
+            <w:tcW w:w="4824" w:type="dxa"/>
+            <w:tcMar>
+              <w:left w:w="100" w:type="dxa"/>
+              <w:right w:w="100" w:type="dxa"/>
+            </w:tcMar>
           </w:tcPr>
           <w:p>
             <w:pPr>
@@ -10787,7 +10481,11 @@
       <w:tr>
         <w:tc>
           <w:tcPr>
-            <w:tcW w:w="2640" w:type="dxa"/>
+            <w:tcW w:w="3096" w:type="dxa"/>
+            <w:tcMar>
+              <w:left w:w="100" w:type="dxa"/>
+              <w:right w:w="100" w:type="dxa"/>
+            </w:tcMar>
           </w:tcPr>
           <w:p>
             <w:pPr>
@@ -10804,7 +10502,11 @@
         </w:tc>
         <w:tc>
           <w:tcPr>
-            <w:tcW w:w="5280" w:type="dxa"/>
+            <w:tcW w:w="4824" w:type="dxa"/>
+            <w:tcMar>
+              <w:left w:w="100" w:type="dxa"/>
+              <w:right w:w="100" w:type="dxa"/>
+            </w:tcMar>
           </w:tcPr>
           <w:p>
             <w:pPr>
@@ -10820,7 +10522,11 @@
       <w:tr>
         <w:tc>
           <w:tcPr>
-            <w:tcW w:w="2640" w:type="dxa"/>
+            <w:tcW w:w="3096" w:type="dxa"/>
+            <w:tcMar>
+              <w:left w:w="100" w:type="dxa"/>
+              <w:right w:w="100" w:type="dxa"/>
+            </w:tcMar>
           </w:tcPr>
           <w:p>
             <w:pPr>
@@ -10837,7 +10543,11 @@
         </w:tc>
         <w:tc>
           <w:tcPr>
-            <w:tcW w:w="5280" w:type="dxa"/>
+            <w:tcW w:w="4824" w:type="dxa"/>
+            <w:tcMar>
+              <w:left w:w="100" w:type="dxa"/>
+              <w:right w:w="100" w:type="dxa"/>
+            </w:tcMar>
           </w:tcPr>
           <w:p>
             <w:pPr>
@@ -10853,7 +10563,11 @@
       <w:tr>
         <w:tc>
           <w:tcPr>
-            <w:tcW w:w="2640" w:type="dxa"/>
+            <w:tcW w:w="3096" w:type="dxa"/>
+            <w:tcMar>
+              <w:left w:w="100" w:type="dxa"/>
+              <w:right w:w="100" w:type="dxa"/>
+            </w:tcMar>
           </w:tcPr>
           <w:p>
             <w:pPr>
@@ -10870,7 +10584,11 @@
         </w:tc>
         <w:tc>
           <w:tcPr>
-            <w:tcW w:w="5280" w:type="dxa"/>
+            <w:tcW w:w="4824" w:type="dxa"/>
+            <w:tcMar>
+              <w:left w:w="100" w:type="dxa"/>
+              <w:right w:w="100" w:type="dxa"/>
+            </w:tcMar>
           </w:tcPr>
           <w:p>
             <w:pPr>
@@ -10886,7 +10604,11 @@
       <w:tr>
         <w:tc>
           <w:tcPr>
-            <w:tcW w:w="2640" w:type="dxa"/>
+            <w:tcW w:w="3096" w:type="dxa"/>
+            <w:tcMar>
+              <w:left w:w="100" w:type="dxa"/>
+              <w:right w:w="100" w:type="dxa"/>
+            </w:tcMar>
           </w:tcPr>
           <w:p>
             <w:pPr>
@@ -10903,7 +10625,11 @@
         </w:tc>
         <w:tc>
           <w:tcPr>
-            <w:tcW w:w="5280" w:type="dxa"/>
+            <w:tcW w:w="4824" w:type="dxa"/>
+            <w:tcMar>
+              <w:left w:w="100" w:type="dxa"/>
+              <w:right w:w="100" w:type="dxa"/>
+            </w:tcMar>
           </w:tcPr>
           <w:p>
             <w:pPr>
@@ -10919,7 +10645,11 @@
       <w:tr>
         <w:tc>
           <w:tcPr>
-            <w:tcW w:w="2640" w:type="dxa"/>
+            <w:tcW w:w="3096" w:type="dxa"/>
+            <w:tcMar>
+              <w:left w:w="100" w:type="dxa"/>
+              <w:right w:w="100" w:type="dxa"/>
+            </w:tcMar>
           </w:tcPr>
           <w:p>
             <w:pPr>
@@ -10936,7 +10666,11 @@
         </w:tc>
         <w:tc>
           <w:tcPr>
-            <w:tcW w:w="5280" w:type="dxa"/>
+            <w:tcW w:w="4824" w:type="dxa"/>
+            <w:tcMar>
+              <w:left w:w="100" w:type="dxa"/>
+              <w:right w:w="100" w:type="dxa"/>
+            </w:tcMar>
           </w:tcPr>
           <w:p>
             <w:pPr>
@@ -11136,6 +10870,7 @@
           <w:numId w:val="42"/>
         </w:numPr>
         <w:pStyle w:val="Compact"/>
+        <w:spacing w:after="60"/>
       </w:pPr>
       <w:r>
         <w:rPr>
@@ -11157,6 +10892,7 @@
           <w:numId w:val="42"/>
         </w:numPr>
         <w:pStyle w:val="Compact"/>
+        <w:spacing w:after="60"/>
       </w:pPr>
       <w:r>
         <w:rPr>

</xml_diff>